<commit_message>
Regenerate report and appendix; add cross-document consistency check
Propagates the intervals, the noise-floor framing and the operational figures into
the report, the appendix and the experiment log, and tightens the report typography
so it still fits the two-page limit with the added content. Point estimates are
unchanged and the locked tables and per-question logs are untouched.

check_consistency verifies three things: that every published point estimate still
matches the per-question logs, that each key figure reads identically wherever it
appears across the report, results, README and log, and that every quoted interval
and latency exists in the JSON the measurement scripts wrote, so nothing was typed
by hand. It normalises line wrapping and emphasis before matching, since a claim
split across a line break is the same claim.
</commit_message>
<xml_diff>
--- a/reports/EXPERIMENT_LOG.docx
+++ b/reports/EXPERIMENT_LOG.docx
@@ -29304,6 +29304,1406 @@
           <w:sz w:val="19"/>
         </w:rPr>
         <w:t xml:space="preserve"> takes any column of the classic series, so the same interface reviews the baseline run or any intermediate config against the identical confidence definition.</w:t>
+      </w:r>
+    </w:p>
+    <w:p>
+      <w:pPr>
+        <w:pBdr>
+          <w:bottom w:val="single" w:sz="6" w:space="1" w:color="B9C2CC"/>
+        </w:pBdr>
+        <w:spacing w:before="160" w:after="160"/>
+      </w:pPr>
+    </w:p>
+    <w:p>
+      <w:r>
+        <w:br w:type="page"/>
+      </w:r>
+    </w:p>
+    <w:p>
+      <w:pPr>
+        <w:pStyle w:val="Heading1"/>
+      </w:pPr>
+      <w:r>
+        <w:t>2026-08-02 — Phase 13: uncertainty, operational characteristics, and an honest KG null</w:t>
+      </w:r>
+    </w:p>
+    <w:p>
+      <w:pPr>
+        <w:jc w:val="both"/>
+      </w:pPr>
+      <w:r>
+        <w:rPr>
+          <w:rFonts w:ascii="Calibri" w:hAnsi="Calibri"/>
+          <w:b w:val="0"/>
+          <w:i w:val="0"/>
+          <w:color w:val="14181D"/>
+          <w:sz w:val="19"/>
+        </w:rPr>
+        <w:t>No API budget was spent. Everything here is computed from the committed per-question logs or measured locally on this machine; the paid model was not called once. Point estimates are unchanged and the run that produced them was not repeated.</w:t>
+      </w:r>
+    </w:p>
+    <w:p>
+      <w:pPr>
+        <w:pStyle w:val="Heading2"/>
+      </w:pPr>
+      <w:r>
+        <w:t>Bootstrap confidence intervals</w:t>
+      </w:r>
+    </w:p>
+    <w:p>
+      <w:pPr>
+        <w:jc w:val="both"/>
+      </w:pPr>
+      <w:r>
+        <w:rPr>
+          <w:rFonts w:ascii="Consolas" w:hAnsi="Consolas"/>
+          <w:b w:val="0"/>
+          <w:i w:val="0"/>
+          <w:color w:val="3D4650"/>
+          <w:sz w:val="17"/>
+        </w:rPr>
+        <w:t>scripts/bootstrap_ci.py</w:t>
+      </w:r>
+      <w:r>
+        <w:rPr>
+          <w:rFonts w:ascii="Calibri" w:hAnsi="Calibri"/>
+          <w:b w:val="0"/>
+          <w:i w:val="0"/>
+          <w:color w:val="14181D"/>
+          <w:sz w:val="19"/>
+        </w:rPr>
+        <w:t xml:space="preserve">: 95% percentile bootstrap over questions, 10,000 resamples, seed 0, on every per-category and per-predicate row. The script </w:t>
+      </w:r>
+      <w:r>
+        <w:rPr>
+          <w:rFonts w:ascii="Calibri" w:hAnsi="Calibri"/>
+          <w:b/>
+          <w:i w:val="0"/>
+          <w:color w:val="14181D"/>
+          <w:sz w:val="19"/>
+        </w:rPr>
+        <w:t>recomputes the point estimates from the logs and asserts them equal to the published `ablation.md` before emitting any interval</w:t>
+      </w:r>
+      <w:r>
+        <w:rPr>
+          <w:rFonts w:ascii="Calibri" w:hAnsi="Calibri"/>
+          <w:b w:val="0"/>
+          <w:i w:val="0"/>
+          <w:color w:val="14181D"/>
+          <w:sz w:val="19"/>
+        </w:rPr>
+        <w:t xml:space="preserve"> — if a point estimate had moved, it aborts rather than quietly publishing a different number under a new heading. All 6 configs x 7 metrics matched.</w:t>
+      </w:r>
+    </w:p>
+    <w:p>
+      <w:pPr>
+        <w:jc w:val="both"/>
+      </w:pPr>
+      <w:r>
+        <w:rPr>
+          <w:rFonts w:ascii="Calibri" w:hAnsi="Calibri"/>
+          <w:b w:val="0"/>
+          <w:i w:val="0"/>
+          <w:color w:val="14181D"/>
+          <w:sz w:val="19"/>
+        </w:rPr>
+        <w:t xml:space="preserve">Per-step effects use a </w:t>
+      </w:r>
+      <w:r>
+        <w:rPr>
+          <w:rFonts w:ascii="Calibri" w:hAnsi="Calibri"/>
+          <w:b/>
+          <w:i w:val="0"/>
+          <w:color w:val="14181D"/>
+          <w:sz w:val="19"/>
+        </w:rPr>
+        <w:t>paired</w:t>
+      </w:r>
+      <w:r>
+        <w:rPr>
+          <w:rFonts w:ascii="Calibri" w:hAnsi="Calibri"/>
+          <w:b w:val="0"/>
+          <w:i w:val="0"/>
+          <w:color w:val="14181D"/>
+          <w:sz w:val="19"/>
+        </w:rPr>
+        <w:t xml:space="preserve"> bootstrap: the same resampled question indices are scored under both configs, because the two arms are the same 127 questions and treating them as independent samples would overstate the interval on their difference.</w:t>
+      </w:r>
+    </w:p>
+    <w:tbl>
+      <w:tblPr>
+        <w:tblStyle w:val="TableGrid"/>
+        <w:tblW w:type="auto" w:w="0"/>
+        <w:jc w:val="center"/>
+        <w:tblLook w:firstColumn="1" w:firstRow="1" w:lastColumn="0" w:lastRow="0" w:noHBand="0" w:noVBand="1" w:val="04A0"/>
+      </w:tblPr>
+      <w:tblGrid>
+        <w:gridCol w:w="2520"/>
+        <w:gridCol w:w="2520"/>
+        <w:gridCol w:w="2520"/>
+        <w:gridCol w:w="2520"/>
+      </w:tblGrid>
+      <w:tr>
+        <w:tc>
+          <w:tcPr>
+            <w:tcW w:type="dxa" w:w="2520"/>
+            <w:shd w:val="clear" w:fill="E7ECF1"/>
+          </w:tcPr>
+          <w:p>
+            <w:r>
+              <w:rPr>
+                <w:b/>
+              </w:rPr>
+            </w:r>
+            <w:r>
+              <w:rPr>
+                <w:rFonts w:ascii="Calibri" w:hAnsi="Calibri"/>
+                <w:b/>
+                <w:i w:val="0"/>
+                <w:color w:val="14181D"/>
+                <w:sz w:val="17"/>
+              </w:rPr>
+              <w:t>step</w:t>
+            </w:r>
+          </w:p>
+        </w:tc>
+        <w:tc>
+          <w:tcPr>
+            <w:tcW w:type="dxa" w:w="2520"/>
+            <w:shd w:val="clear" w:fill="E7ECF1"/>
+          </w:tcPr>
+          <w:p>
+            <w:r>
+              <w:rPr>
+                <w:b/>
+              </w:rPr>
+            </w:r>
+            <w:r>
+              <w:rPr>
+                <w:rFonts w:ascii="Calibri" w:hAnsi="Calibri"/>
+                <w:b/>
+                <w:i w:val="0"/>
+                <w:color w:val="14181D"/>
+                <w:sz w:val="17"/>
+              </w:rPr>
+              <w:t>ΔR@5</w:t>
+            </w:r>
+          </w:p>
+        </w:tc>
+        <w:tc>
+          <w:tcPr>
+            <w:tcW w:type="dxa" w:w="2520"/>
+            <w:shd w:val="clear" w:fill="E7ECF1"/>
+          </w:tcPr>
+          <w:p>
+            <w:r>
+              <w:rPr>
+                <w:b/>
+              </w:rPr>
+            </w:r>
+            <w:r>
+              <w:rPr>
+                <w:rFonts w:ascii="Calibri" w:hAnsi="Calibri"/>
+                <w:b/>
+                <w:i w:val="0"/>
+                <w:color w:val="14181D"/>
+                <w:sz w:val="17"/>
+              </w:rPr>
+              <w:t>ΔCorrect</w:t>
+            </w:r>
+          </w:p>
+        </w:tc>
+        <w:tc>
+          <w:tcPr>
+            <w:tcW w:type="dxa" w:w="2520"/>
+            <w:shd w:val="clear" w:fill="E7ECF1"/>
+          </w:tcPr>
+          <w:p>
+            <w:r>
+              <w:rPr>
+                <w:b/>
+              </w:rPr>
+            </w:r>
+            <w:r>
+              <w:rPr>
+                <w:rFonts w:ascii="Calibri" w:hAnsi="Calibri"/>
+                <w:b/>
+                <w:i w:val="0"/>
+                <w:color w:val="14181D"/>
+                <w:sz w:val="17"/>
+              </w:rPr>
+              <w:t>verdict</w:t>
+            </w:r>
+          </w:p>
+        </w:tc>
+      </w:tr>
+      <w:tr>
+        <w:tc>
+          <w:tcPr>
+            <w:tcW w:type="dxa" w:w="2520"/>
+          </w:tcPr>
+          <w:p>
+            <w:r/>
+            <w:r>
+              <w:rPr>
+                <w:rFonts w:ascii="Calibri" w:hAnsi="Calibri"/>
+                <w:b w:val="0"/>
+                <w:i w:val="0"/>
+                <w:color w:val="14181D"/>
+                <w:sz w:val="17"/>
+              </w:rPr>
+              <w:t>baseline → +layout</w:t>
+            </w:r>
+          </w:p>
+        </w:tc>
+        <w:tc>
+          <w:tcPr>
+            <w:tcW w:type="dxa" w:w="2520"/>
+          </w:tcPr>
+          <w:p>
+            <w:r/>
+            <w:r>
+              <w:rPr>
+                <w:rFonts w:ascii="Calibri" w:hAnsi="Calibri"/>
+                <w:b w:val="0"/>
+                <w:i w:val="0"/>
+                <w:color w:val="14181D"/>
+                <w:sz w:val="17"/>
+              </w:rPr>
+              <w:t>+0.190 [+0.107, +0.274]</w:t>
+            </w:r>
+          </w:p>
+        </w:tc>
+        <w:tc>
+          <w:tcPr>
+            <w:tcW w:type="dxa" w:w="2520"/>
+          </w:tcPr>
+          <w:p>
+            <w:r/>
+            <w:r>
+              <w:rPr>
+                <w:rFonts w:ascii="Calibri" w:hAnsi="Calibri"/>
+                <w:b w:val="0"/>
+                <w:i w:val="0"/>
+                <w:color w:val="14181D"/>
+                <w:sz w:val="17"/>
+              </w:rPr>
+              <w:t>+0.065 [+0.000, +0.132]</w:t>
+            </w:r>
+          </w:p>
+        </w:tc>
+        <w:tc>
+          <w:tcPr>
+            <w:tcW w:type="dxa" w:w="2520"/>
+          </w:tcPr>
+          <w:p>
+            <w:r/>
+            <w:r>
+              <w:rPr>
+                <w:rFonts w:ascii="Calibri" w:hAnsi="Calibri"/>
+                <w:b w:val="0"/>
+                <w:i w:val="0"/>
+                <w:color w:val="14181D"/>
+                <w:sz w:val="17"/>
+              </w:rPr>
+              <w:t>R@5 real</w:t>
+            </w:r>
+          </w:p>
+        </w:tc>
+      </w:tr>
+      <w:tr>
+        <w:tc>
+          <w:tcPr>
+            <w:tcW w:type="dxa" w:w="2520"/>
+          </w:tcPr>
+          <w:p>
+            <w:r/>
+            <w:r>
+              <w:rPr>
+                <w:rFonts w:ascii="Calibri" w:hAnsi="Calibri"/>
+                <w:b w:val="0"/>
+                <w:i w:val="0"/>
+                <w:color w:val="14181D"/>
+                <w:sz w:val="17"/>
+              </w:rPr>
+              <w:t>+layout → +clip</w:t>
+            </w:r>
+          </w:p>
+        </w:tc>
+        <w:tc>
+          <w:tcPr>
+            <w:tcW w:type="dxa" w:w="2520"/>
+          </w:tcPr>
+          <w:p>
+            <w:r/>
+            <w:r>
+              <w:rPr>
+                <w:rFonts w:ascii="Calibri" w:hAnsi="Calibri"/>
+                <w:b/>
+                <w:i w:val="0"/>
+                <w:color w:val="14181D"/>
+                <w:sz w:val="17"/>
+              </w:rPr>
+              <w:t>+0.000 [+0.000, +0.000]</w:t>
+            </w:r>
+          </w:p>
+        </w:tc>
+        <w:tc>
+          <w:tcPr>
+            <w:tcW w:type="dxa" w:w="2520"/>
+          </w:tcPr>
+          <w:p>
+            <w:r/>
+            <w:r>
+              <w:rPr>
+                <w:rFonts w:ascii="Calibri" w:hAnsi="Calibri"/>
+                <w:b w:val="0"/>
+                <w:i w:val="0"/>
+                <w:color w:val="14181D"/>
+                <w:sz w:val="17"/>
+              </w:rPr>
+              <w:t>+0.000 [−0.018, +0.023]</w:t>
+            </w:r>
+          </w:p>
+        </w:tc>
+        <w:tc>
+          <w:tcPr>
+            <w:tcW w:type="dxa" w:w="2520"/>
+          </w:tcPr>
+          <w:p>
+            <w:r/>
+            <w:r>
+              <w:rPr>
+                <w:rFonts w:ascii="Calibri" w:hAnsi="Calibri"/>
+                <w:b w:val="0"/>
+                <w:i w:val="0"/>
+                <w:color w:val="14181D"/>
+                <w:sz w:val="17"/>
+              </w:rPr>
+              <w:t>within noise</w:t>
+            </w:r>
+          </w:p>
+        </w:tc>
+      </w:tr>
+      <w:tr>
+        <w:tc>
+          <w:tcPr>
+            <w:tcW w:type="dxa" w:w="2520"/>
+          </w:tcPr>
+          <w:p>
+            <w:r/>
+            <w:r>
+              <w:rPr>
+                <w:rFonts w:ascii="Calibri" w:hAnsi="Calibri"/>
+                <w:b w:val="0"/>
+                <w:i w:val="0"/>
+                <w:color w:val="14181D"/>
+                <w:sz w:val="17"/>
+              </w:rPr>
+              <w:t>+clip → +caption</w:t>
+            </w:r>
+          </w:p>
+        </w:tc>
+        <w:tc>
+          <w:tcPr>
+            <w:tcW w:type="dxa" w:w="2520"/>
+          </w:tcPr>
+          <w:p>
+            <w:r/>
+            <w:r>
+              <w:rPr>
+                <w:rFonts w:ascii="Calibri" w:hAnsi="Calibri"/>
+                <w:b w:val="0"/>
+                <w:i w:val="0"/>
+                <w:color w:val="14181D"/>
+                <w:sz w:val="17"/>
+              </w:rPr>
+              <w:t>+0.069 [+0.035, +0.107]</w:t>
+            </w:r>
+          </w:p>
+        </w:tc>
+        <w:tc>
+          <w:tcPr>
+            <w:tcW w:type="dxa" w:w="2520"/>
+          </w:tcPr>
+          <w:p>
+            <w:r/>
+            <w:r>
+              <w:rPr>
+                <w:rFonts w:ascii="Calibri" w:hAnsi="Calibri"/>
+                <w:b w:val="0"/>
+                <w:i w:val="0"/>
+                <w:color w:val="14181D"/>
+                <w:sz w:val="17"/>
+              </w:rPr>
+              <w:t>+0.000 [−0.030, +0.030]</w:t>
+            </w:r>
+          </w:p>
+        </w:tc>
+        <w:tc>
+          <w:tcPr>
+            <w:tcW w:type="dxa" w:w="2520"/>
+          </w:tcPr>
+          <w:p>
+            <w:r/>
+            <w:r>
+              <w:rPr>
+                <w:rFonts w:ascii="Calibri" w:hAnsi="Calibri"/>
+                <w:b w:val="0"/>
+                <w:i w:val="0"/>
+                <w:color w:val="14181D"/>
+                <w:sz w:val="17"/>
+              </w:rPr>
+              <w:t>R@5 real</w:t>
+            </w:r>
+          </w:p>
+        </w:tc>
+      </w:tr>
+      <w:tr>
+        <w:tc>
+          <w:tcPr>
+            <w:tcW w:type="dxa" w:w="2520"/>
+          </w:tcPr>
+          <w:p>
+            <w:r/>
+            <w:r>
+              <w:rPr>
+                <w:rFonts w:ascii="Calibri" w:hAnsi="Calibri"/>
+                <w:b w:val="0"/>
+                <w:i w:val="0"/>
+                <w:color w:val="14181D"/>
+                <w:sz w:val="17"/>
+              </w:rPr>
+              <w:t>+caption → +kg</w:t>
+            </w:r>
+          </w:p>
+        </w:tc>
+        <w:tc>
+          <w:tcPr>
+            <w:tcW w:type="dxa" w:w="2520"/>
+          </w:tcPr>
+          <w:p>
+            <w:r/>
+            <w:r>
+              <w:rPr>
+                <w:rFonts w:ascii="Calibri" w:hAnsi="Calibri"/>
+                <w:b w:val="0"/>
+                <w:i w:val="0"/>
+                <w:color w:val="14181D"/>
+                <w:sz w:val="17"/>
+              </w:rPr>
+              <w:t>+0.026 [+0.000, +0.059]</w:t>
+            </w:r>
+          </w:p>
+        </w:tc>
+        <w:tc>
+          <w:tcPr>
+            <w:tcW w:type="dxa" w:w="2520"/>
+          </w:tcPr>
+          <w:p>
+            <w:r/>
+            <w:r>
+              <w:rPr>
+                <w:rFonts w:ascii="Calibri" w:hAnsi="Calibri"/>
+                <w:b w:val="0"/>
+                <w:i w:val="0"/>
+                <w:color w:val="14181D"/>
+                <w:sz w:val="17"/>
+              </w:rPr>
+              <w:t>+0.030 [+0.004, +0.064]</w:t>
+            </w:r>
+          </w:p>
+        </w:tc>
+        <w:tc>
+          <w:tcPr>
+            <w:tcW w:type="dxa" w:w="2520"/>
+          </w:tcPr>
+          <w:p>
+            <w:r/>
+            <w:r>
+              <w:rPr>
+                <w:rFonts w:ascii="Calibri" w:hAnsi="Calibri"/>
+                <w:b w:val="0"/>
+                <w:i w:val="0"/>
+                <w:color w:val="14181D"/>
+                <w:sz w:val="17"/>
+              </w:rPr>
+              <w:t>on the ±0.03 floor</w:t>
+            </w:r>
+          </w:p>
+        </w:tc>
+      </w:tr>
+      <w:tr>
+        <w:tc>
+          <w:tcPr>
+            <w:tcW w:type="dxa" w:w="2520"/>
+          </w:tcPr>
+          <w:p>
+            <w:r/>
+            <w:r>
+              <w:rPr>
+                <w:rFonts w:ascii="Calibri" w:hAnsi="Calibri"/>
+                <w:b w:val="0"/>
+                <w:i w:val="0"/>
+                <w:color w:val="14181D"/>
+                <w:sz w:val="17"/>
+              </w:rPr>
+              <w:t>+kg → +rerank</w:t>
+            </w:r>
+          </w:p>
+        </w:tc>
+        <w:tc>
+          <w:tcPr>
+            <w:tcW w:type="dxa" w:w="2520"/>
+          </w:tcPr>
+          <w:p>
+            <w:r/>
+            <w:r>
+              <w:rPr>
+                <w:rFonts w:ascii="Calibri" w:hAnsi="Calibri"/>
+                <w:b w:val="0"/>
+                <w:i w:val="0"/>
+                <w:color w:val="14181D"/>
+                <w:sz w:val="17"/>
+              </w:rPr>
+              <w:t>+0.056 [+0.022, +0.097]</w:t>
+            </w:r>
+          </w:p>
+        </w:tc>
+        <w:tc>
+          <w:tcPr>
+            <w:tcW w:type="dxa" w:w="2520"/>
+          </w:tcPr>
+          <w:p>
+            <w:r/>
+            <w:r>
+              <w:rPr>
+                <w:rFonts w:ascii="Calibri" w:hAnsi="Calibri"/>
+                <w:b w:val="0"/>
+                <w:i w:val="0"/>
+                <w:color w:val="14181D"/>
+                <w:sz w:val="17"/>
+              </w:rPr>
+              <w:t>+0.004 [−0.037, +0.048]</w:t>
+            </w:r>
+          </w:p>
+        </w:tc>
+        <w:tc>
+          <w:tcPr>
+            <w:tcW w:type="dxa" w:w="2520"/>
+          </w:tcPr>
+          <w:p>
+            <w:r/>
+            <w:r>
+              <w:rPr>
+                <w:rFonts w:ascii="Calibri" w:hAnsi="Calibri"/>
+                <w:b w:val="0"/>
+                <w:i w:val="0"/>
+                <w:color w:val="14181D"/>
+                <w:sz w:val="17"/>
+              </w:rPr>
+              <w:t>R@5 real</w:t>
+            </w:r>
+          </w:p>
+        </w:tc>
+      </w:tr>
+      <w:tr>
+        <w:tc>
+          <w:tcPr>
+            <w:tcW w:type="dxa" w:w="2520"/>
+          </w:tcPr>
+          <w:p>
+            <w:r/>
+            <w:r>
+              <w:rPr>
+                <w:rFonts w:ascii="Calibri" w:hAnsi="Calibri"/>
+                <w:b w:val="0"/>
+                <w:i w:val="0"/>
+                <w:color w:val="14181D"/>
+                <w:sz w:val="17"/>
+              </w:rPr>
+              <w:t>baseline → +rerank</w:t>
+            </w:r>
+          </w:p>
+        </w:tc>
+        <w:tc>
+          <w:tcPr>
+            <w:tcW w:type="dxa" w:w="2520"/>
+          </w:tcPr>
+          <w:p>
+            <w:r/>
+            <w:r>
+              <w:rPr>
+                <w:rFonts w:ascii="Calibri" w:hAnsi="Calibri"/>
+                <w:b w:val="0"/>
+                <w:i w:val="0"/>
+                <w:color w:val="14181D"/>
+                <w:sz w:val="17"/>
+              </w:rPr>
+              <w:t>+0.341 [+0.258, +0.424]</w:t>
+            </w:r>
+          </w:p>
+        </w:tc>
+        <w:tc>
+          <w:tcPr>
+            <w:tcW w:type="dxa" w:w="2520"/>
+          </w:tcPr>
+          <w:p>
+            <w:r/>
+            <w:r>
+              <w:rPr>
+                <w:rFonts w:ascii="Calibri" w:hAnsi="Calibri"/>
+                <w:b w:val="0"/>
+                <w:i w:val="0"/>
+                <w:color w:val="14181D"/>
+                <w:sz w:val="17"/>
+              </w:rPr>
+              <w:t>+0.099 [+0.034, +0.168]</w:t>
+            </w:r>
+          </w:p>
+        </w:tc>
+        <w:tc>
+          <w:tcPr>
+            <w:tcW w:type="dxa" w:w="2520"/>
+          </w:tcPr>
+          <w:p>
+            <w:r/>
+            <w:r>
+              <w:rPr>
+                <w:rFonts w:ascii="Calibri" w:hAnsi="Calibri"/>
+                <w:b w:val="0"/>
+                <w:i w:val="0"/>
+                <w:color w:val="14181D"/>
+                <w:sz w:val="17"/>
+              </w:rPr>
+              <w:t>both real</w:t>
+            </w:r>
+          </w:p>
+        </w:tc>
+      </w:tr>
+    </w:tbl>
+    <w:p>
+      <w:pPr>
+        <w:spacing w:after="80"/>
+      </w:pPr>
+    </w:p>
+    <w:p>
+      <w:pPr>
+        <w:jc w:val="both"/>
+      </w:pPr>
+      <w:r>
+        <w:rPr>
+          <w:rFonts w:ascii="Calibri" w:hAnsi="Calibri"/>
+          <w:b w:val="0"/>
+          <w:i w:val="0"/>
+          <w:color w:val="14181D"/>
+          <w:sz w:val="19"/>
+        </w:rPr>
+        <w:t>Two results the intervals changed, and both are corrections to how earlier text read:</w:t>
+      </w:r>
+    </w:p>
+    <w:p>
+      <w:pPr>
+        <w:jc w:val="both"/>
+      </w:pPr>
+      <w:r>
+        <w:rPr>
+          <w:rFonts w:ascii="Calibri" w:hAnsi="Calibri"/>
+          <w:b/>
+          <w:i w:val="0"/>
+          <w:color w:val="14181D"/>
+          <w:sz w:val="19"/>
+        </w:rPr>
+        <w:t>The headline survives; the correctness claim needs the paired analysis to stand.</w:t>
+      </w:r>
+      <w:r>
+        <w:rPr>
+          <w:rFonts w:ascii="Calibri" w:hAnsi="Calibri"/>
+          <w:b w:val="0"/>
+          <w:i w:val="0"/>
+          <w:color w:val="14181D"/>
+          <w:sz w:val="19"/>
+        </w:rPr>
+        <w:t xml:space="preserve"> Baseline R@5 0.57 [0.49, 0.66] and enhanced 0.91 [0.86, 0.96] do not overlap. But correctness 0.59 [0.51, 0.67] → 0.69 [0.61, 0.77] </w:t>
+      </w:r>
+      <w:r>
+        <w:rPr>
+          <w:rFonts w:ascii="Calibri" w:hAnsi="Calibri"/>
+          <w:b w:val="0"/>
+          <w:i/>
+          <w:color w:val="14181D"/>
+          <w:sz w:val="19"/>
+        </w:rPr>
+        <w:t>does</w:t>
+      </w:r>
+      <w:r>
+        <w:rPr>
+          <w:rFonts w:ascii="Calibri" w:hAnsi="Calibri"/>
+          <w:b w:val="0"/>
+          <w:i w:val="0"/>
+          <w:color w:val="14181D"/>
+          <w:sz w:val="19"/>
+        </w:rPr>
+        <w:t xml:space="preserve"> overlap marginally — it is only the paired difference, +0.099 [+0.034, +0.168], that excludes zero. Both are now reported, because the marginal overlap is the conservative reading and the paired interval the powerful one, and they disagree about how confident to be.</w:t>
+      </w:r>
+    </w:p>
+    <w:p>
+      <w:pPr>
+        <w:jc w:val="both"/>
+      </w:pPr>
+      <w:r>
+        <w:rPr>
+          <w:rFonts w:ascii="Calibri" w:hAnsi="Calibri"/>
+          <w:b/>
+          <w:i w:val="0"/>
+          <w:color w:val="14181D"/>
+          <w:sz w:val="19"/>
+        </w:rPr>
+        <w:t>`figure_value`'s jump is not statistically separated.</w:t>
+      </w:r>
+      <w:r>
+        <w:rPr>
+          <w:rFonts w:ascii="Calibri" w:hAnsi="Calibri"/>
+          <w:b w:val="0"/>
+          <w:i w:val="0"/>
+          <w:color w:val="14181D"/>
+          <w:sz w:val="19"/>
+        </w:rPr>
+        <w:t xml:space="preserve"> 0.38 → 0.75 at n=8 is [0.12, 0.75] → [0.38, 1.00]. The intervals overlap heavily. The mechanism is independently verified — page-crop expansion took gold-crop retrieval from 2/4 to 8/8 — and that, not the correctness delta, is the evidence. Eight questions cannot carry more.</w:t>
+      </w:r>
+    </w:p>
+    <w:p>
+      <w:pPr>
+        <w:jc w:val="both"/>
+      </w:pPr>
+      <w:r>
+        <w:rPr>
+          <w:rFonts w:ascii="Calibri" w:hAnsi="Calibri"/>
+          <w:b w:val="0"/>
+          <w:i w:val="0"/>
+          <w:color w:val="14181D"/>
+          <w:sz w:val="19"/>
+        </w:rPr>
+        <w:t xml:space="preserve">Per-predicate, </w:t>
+      </w:r>
+      <w:r>
+        <w:rPr>
+          <w:rFonts w:ascii="Calibri" w:hAnsi="Calibri"/>
+          <w:b/>
+          <w:i w:val="0"/>
+          <w:color w:val="14181D"/>
+          <w:sz w:val="19"/>
+        </w:rPr>
+        <w:t>every interval is wide</w:t>
+      </w:r>
+      <w:r>
+        <w:rPr>
+          <w:rFonts w:ascii="Calibri" w:hAnsi="Calibri"/>
+          <w:b w:val="0"/>
+          <w:i w:val="0"/>
+          <w:color w:val="14181D"/>
+          <w:sz w:val="19"/>
+        </w:rPr>
+        <w:t xml:space="preserve">; the narrowest spans 0.38. Only </w:t>
+      </w:r>
+      <w:r>
+        <w:rPr>
+          <w:rFonts w:ascii="Consolas" w:hAnsi="Consolas"/>
+          <w:b w:val="0"/>
+          <w:i w:val="0"/>
+          <w:color w:val="3D4650"/>
+          <w:sz w:val="17"/>
+        </w:rPr>
+        <w:t>occurs_in</w:t>
+      </w:r>
+      <w:r>
+        <w:rPr>
+          <w:rFonts w:ascii="Calibri" w:hAnsi="Calibri"/>
+          <w:b w:val="0"/>
+          <w:i w:val="0"/>
+          <w:color w:val="14181D"/>
+          <w:sz w:val="19"/>
+        </w:rPr>
+        <w:t xml:space="preserve"> separates: its interval tops out at 0.50, below every other predicate's point estimate. The rest are ordered but not distinguished, and the earlier per-predicate ranking should not have been read as one.</w:t>
+      </w:r>
+    </w:p>
+    <w:p>
+      <w:pPr>
+        <w:jc w:val="both"/>
+      </w:pPr>
+      <w:r>
+        <w:rPr>
+          <w:rFonts w:ascii="Calibri" w:hAnsi="Calibri"/>
+          <w:b w:val="0"/>
+          <w:i w:val="0"/>
+          <w:color w:val="14181D"/>
+          <w:sz w:val="19"/>
+        </w:rPr>
+        <w:t xml:space="preserve">A mechanical threshold was deliberately not left to decide the </w:t>
+      </w:r>
+      <w:r>
+        <w:rPr>
+          <w:rFonts w:ascii="Consolas" w:hAnsi="Consolas"/>
+          <w:b w:val="0"/>
+          <w:i w:val="0"/>
+          <w:color w:val="3D4650"/>
+          <w:sz w:val="17"/>
+        </w:rPr>
+        <w:t>+kg</w:t>
+      </w:r>
+      <w:r>
+        <w:rPr>
+          <w:rFonts w:ascii="Calibri" w:hAnsi="Calibri"/>
+          <w:b w:val="0"/>
+          <w:i w:val="0"/>
+          <w:color w:val="14181D"/>
+          <w:sz w:val="19"/>
+        </w:rPr>
+        <w:t xml:space="preserve"> case. Its ΔCorrect is +0.0302 against a floor of 0.03 — "real" by two ten-thousandths, which is false precision. The script now labels an effect whose interval excludes zero but whose magnitude lands on the measured floor as </w:t>
+      </w:r>
+      <w:r>
+        <w:rPr>
+          <w:rFonts w:ascii="Calibri" w:hAnsi="Calibri"/>
+          <w:b w:val="0"/>
+          <w:i/>
+          <w:color w:val="14181D"/>
+          <w:sz w:val="19"/>
+        </w:rPr>
+        <w:t>sitting on the floor</w:t>
+      </w:r>
+      <w:r>
+        <w:rPr>
+          <w:rFonts w:ascii="Calibri" w:hAnsi="Calibri"/>
+          <w:b w:val="0"/>
+          <w:i w:val="0"/>
+          <w:color w:val="14181D"/>
+          <w:sz w:val="19"/>
+        </w:rPr>
+        <w:t>, and says so rather than letting a comparison of thousandths make the claim.</w:t>
+      </w:r>
+    </w:p>
+    <w:p>
+      <w:pPr>
+        <w:pStyle w:val="Heading2"/>
+      </w:pPr>
+      <w:r>
+        <w:t>The knowledge graph did not demonstrably help on this corpus</w:t>
+      </w:r>
+    </w:p>
+    <w:p>
+      <w:pPr>
+        <w:jc w:val="both"/>
+      </w:pPr>
+      <w:r>
+        <w:rPr>
+          <w:rFonts w:ascii="Calibri" w:hAnsi="Calibri"/>
+          <w:b w:val="0"/>
+          <w:i w:val="0"/>
+          <w:color w:val="14181D"/>
+          <w:sz w:val="19"/>
+        </w:rPr>
+        <w:t xml:space="preserve">Stated up front in </w:t>
+      </w:r>
+      <w:r>
+        <w:rPr>
+          <w:rFonts w:ascii="Consolas" w:hAnsi="Consolas"/>
+          <w:b w:val="0"/>
+          <w:i w:val="0"/>
+          <w:color w:val="3D4650"/>
+          <w:sz w:val="17"/>
+        </w:rPr>
+        <w:t>RESULTS.md</w:t>
+      </w:r>
+      <w:r>
+        <w:rPr>
+          <w:rFonts w:ascii="Calibri" w:hAnsi="Calibri"/>
+          <w:b w:val="0"/>
+          <w:i w:val="0"/>
+          <w:color w:val="14181D"/>
+          <w:sz w:val="19"/>
+        </w:rPr>
+        <w:t xml:space="preserve"> and the report, before the per-flag table rather than buried under it. The retrieval win is </w:t>
+      </w:r>
+      <w:r>
+        <w:rPr>
+          <w:rFonts w:ascii="Calibri" w:hAnsi="Calibri"/>
+          <w:b/>
+          <w:i w:val="0"/>
+          <w:color w:val="14181D"/>
+          <w:sz w:val="19"/>
+        </w:rPr>
+        <w:t>layout chunking and caption anchoring</w:t>
+      </w:r>
+      <w:r>
+        <w:rPr>
+          <w:rFonts w:ascii="Calibri" w:hAnsi="Calibri"/>
+          <w:b w:val="0"/>
+          <w:i w:val="0"/>
+          <w:color w:val="14181D"/>
+          <w:sz w:val="19"/>
+        </w:rPr>
+        <w:t xml:space="preserve">, with reranking third. It is </w:t>
+      </w:r>
+      <w:r>
+        <w:rPr>
+          <w:rFonts w:ascii="Calibri" w:hAnsi="Calibri"/>
+          <w:b/>
+          <w:i w:val="0"/>
+          <w:color w:val="14181D"/>
+          <w:sz w:val="19"/>
+        </w:rPr>
+        <w:t>not</w:t>
+      </w:r>
+      <w:r>
+        <w:rPr>
+          <w:rFonts w:ascii="Calibri" w:hAnsi="Calibri"/>
+          <w:b w:val="0"/>
+          <w:i w:val="0"/>
+          <w:color w:val="14181D"/>
+          <w:sz w:val="19"/>
+        </w:rPr>
+        <w:t xml:space="preserve"> image embeddings — </w:t>
+      </w:r>
+      <w:r>
+        <w:rPr>
+          <w:rFonts w:ascii="Consolas" w:hAnsi="Consolas"/>
+          <w:b w:val="0"/>
+          <w:i w:val="0"/>
+          <w:color w:val="3D4650"/>
+          <w:sz w:val="17"/>
+        </w:rPr>
+        <w:t>+clip</w:t>
+      </w:r>
+      <w:r>
+        <w:rPr>
+          <w:rFonts w:ascii="Calibri" w:hAnsi="Calibri"/>
+          <w:b w:val="0"/>
+          <w:i w:val="0"/>
+          <w:color w:val="14181D"/>
+          <w:sz w:val="19"/>
+        </w:rPr>
+        <w:t xml:space="preserve">'s ΔR@5 interval is [+0.000, +0.000], exactly nothing, not merely small. And the KG's contribution is within the noise floor: retrieval +0.026 with an interval touching zero, correctness +0.030 whose magnitude </w:t>
+      </w:r>
+      <w:r>
+        <w:rPr>
+          <w:rFonts w:ascii="Calibri" w:hAnsi="Calibri"/>
+          <w:b w:val="0"/>
+          <w:i/>
+          <w:color w:val="14181D"/>
+          <w:sz w:val="19"/>
+        </w:rPr>
+        <w:t>is</w:t>
+      </w:r>
+      <w:r>
+        <w:rPr>
+          <w:rFonts w:ascii="Calibri" w:hAnsi="Calibri"/>
+          <w:b w:val="0"/>
+          <w:i w:val="0"/>
+          <w:color w:val="14181D"/>
+          <w:sz w:val="19"/>
+        </w:rPr>
+        <w:t xml:space="preserve"> the floor.</w:t>
+      </w:r>
+    </w:p>
+    <w:p>
+      <w:pPr>
+        <w:jc w:val="both"/>
+      </w:pPr>
+      <w:r>
+        <w:rPr>
+          <w:rFonts w:ascii="Calibri" w:hAnsi="Calibri"/>
+          <w:b/>
+          <w:i w:val="0"/>
+          <w:color w:val="14181D"/>
+          <w:sz w:val="19"/>
+        </w:rPr>
+        <w:t>The diagnosis is the useful part.</w:t>
+      </w:r>
+      <w:r>
+        <w:rPr>
+          <w:rFonts w:ascii="Calibri" w:hAnsi="Calibri"/>
+          <w:b w:val="0"/>
+          <w:i w:val="0"/>
+          <w:color w:val="14181D"/>
+          <w:sz w:val="19"/>
+        </w:rPr>
+        <w:t xml:space="preserve"> This dataset carries no document identifier, so page = paper, which forces every </w:t>
+      </w:r>
+      <w:r>
+        <w:rPr>
+          <w:rFonts w:ascii="Consolas" w:hAnsi="Consolas"/>
+          <w:b w:val="0"/>
+          <w:i w:val="0"/>
+          <w:color w:val="3D4650"/>
+          <w:sz w:val="17"/>
+        </w:rPr>
+        <w:t>multi_hop</w:t>
+      </w:r>
+      <w:r>
+        <w:rPr>
+          <w:rFonts w:ascii="Calibri" w:hAnsi="Calibri"/>
+          <w:b w:val="0"/>
+          <w:i w:val="0"/>
+          <w:color w:val="14181D"/>
+          <w:sz w:val="19"/>
+        </w:rPr>
+        <w:t xml:space="preserve"> question to be answerable </w:t>
+      </w:r>
+      <w:r>
+        <w:rPr>
+          <w:rFonts w:ascii="Calibri" w:hAnsi="Calibri"/>
+          <w:b w:val="0"/>
+          <w:i/>
+          <w:color w:val="14181D"/>
+          <w:sz w:val="19"/>
+        </w:rPr>
+        <w:t>within one page</w:t>
+      </w:r>
+      <w:r>
+        <w:rPr>
+          <w:rFonts w:ascii="Calibri" w:hAnsi="Calibri"/>
+          <w:b w:val="0"/>
+          <w:i w:val="0"/>
+          <w:color w:val="14181D"/>
+          <w:sz w:val="19"/>
+        </w:rPr>
+        <w:t xml:space="preserve"> — precisely the regime where a graph helps least, because both hops already sit in the same retrieval neighbourhood and dense text reaches them without traversing anything. A knowledge graph earns its cost when evidence is scattered </w:t>
+      </w:r>
+      <w:r>
+        <w:rPr>
+          <w:rFonts w:ascii="Calibri" w:hAnsi="Calibri"/>
+          <w:b/>
+          <w:i w:val="0"/>
+          <w:color w:val="14181D"/>
+          <w:sz w:val="19"/>
+        </w:rPr>
+        <w:t>across</w:t>
+      </w:r>
+      <w:r>
+        <w:rPr>
+          <w:rFonts w:ascii="Calibri" w:hAnsi="Calibri"/>
+          <w:b w:val="0"/>
+          <w:i w:val="0"/>
+          <w:color w:val="14181D"/>
+          <w:sz w:val="19"/>
+        </w:rPr>
+        <w:t xml:space="preserve"> documents, and that is the corpus PubLayNet cannot supply here. So this is a null result about this corpus, not about GraphRAG. The pipeline is </w:t>
+      </w:r>
+      <w:r>
+        <w:rPr>
+          <w:rFonts w:ascii="Consolas" w:hAnsi="Consolas"/>
+          <w:b w:val="0"/>
+          <w:i w:val="0"/>
+          <w:color w:val="3D4650"/>
+          <w:sz w:val="17"/>
+        </w:rPr>
+        <w:t>paper_id</w:t>
+      </w:r>
+      <w:r>
+        <w:rPr>
+          <w:rFonts w:ascii="Calibri" w:hAnsi="Calibri"/>
+          <w:b w:val="0"/>
+          <w:i w:val="0"/>
+          <w:color w:val="14181D"/>
+          <w:sz w:val="19"/>
+        </w:rPr>
+        <w:t>-agnostic for exactly this reason: a real multi-document corpus can be swapped in and the question asked properly.</w:t>
+      </w:r>
+    </w:p>
+    <w:p>
+      <w:pPr>
+        <w:jc w:val="both"/>
+      </w:pPr>
+      <w:r>
+        <w:rPr>
+          <w:rFonts w:ascii="Calibri" w:hAnsi="Calibri"/>
+          <w:b w:val="0"/>
+          <w:i w:val="0"/>
+          <w:color w:val="14181D"/>
+          <w:sz w:val="19"/>
+        </w:rPr>
+        <w:t>Recording this plainly is worth more than the alternative. The KG machinery is real — closed schema, code-enforced, grounded edges, 1,819 of them — and it is the honest framing that it did not pay for itself on a within-page corpus.</w:t>
+      </w:r>
+    </w:p>
+    <w:p>
+      <w:pPr>
+        <w:pStyle w:val="Heading2"/>
+      </w:pPr>
+      <w:r>
+        <w:t>Single-seed, and why</w:t>
+      </w:r>
+    </w:p>
+    <w:p>
+      <w:pPr>
+        <w:jc w:val="both"/>
+      </w:pPr>
+      <w:r>
+        <w:rPr>
+          <w:rFonts w:ascii="Calibri" w:hAnsi="Calibri"/>
+          <w:b w:val="0"/>
+          <w:i w:val="0"/>
+          <w:color w:val="14181D"/>
+          <w:sz w:val="19"/>
+        </w:rPr>
+        <w:t xml:space="preserve">Runs are single-seed by budget: repeating a six-config ablation costs about $5. Rather than leave that as an unquantified caveat, the two uncertainties are separated and both reported. Sampling uncertainty is the bootstrap above. Run-to-run variance was </w:t>
+      </w:r>
+      <w:r>
+        <w:rPr>
+          <w:rFonts w:ascii="Calibri" w:hAnsi="Calibri"/>
+          <w:b/>
+          <w:i w:val="0"/>
+          <w:color w:val="14181D"/>
+          <w:sz w:val="19"/>
+        </w:rPr>
+        <w:t>measured directly</w:t>
+      </w:r>
+      <w:r>
+        <w:rPr>
+          <w:rFonts w:ascii="Calibri" w:hAnsi="Calibri"/>
+          <w:b w:val="0"/>
+          <w:i w:val="0"/>
+          <w:color w:val="14181D"/>
+          <w:sz w:val="19"/>
+        </w:rPr>
+        <w:t xml:space="preserve"> in Phase 11 — an identical configuration re-run over the same 17 multi_hop questions moved correctness by 0.029 — so the ±0.03 floor is an observation, not an assumption, and every effect is judged against it.</w:t>
+      </w:r>
+    </w:p>
+    <w:p>
+      <w:pPr>
+        <w:pStyle w:val="Heading2"/>
+      </w:pPr>
+      <w:r>
+        <w:t>Operational characteristics</w:t>
+      </w:r>
+    </w:p>
+    <w:p>
+      <w:pPr>
+        <w:jc w:val="both"/>
+      </w:pPr>
+      <w:r>
+        <w:rPr>
+          <w:rFonts w:ascii="Consolas" w:hAnsi="Consolas"/>
+          <w:b w:val="0"/>
+          <w:i w:val="0"/>
+          <w:color w:val="3D4650"/>
+          <w:sz w:val="17"/>
+        </w:rPr>
+        <w:t>scripts/measure_ops.py</w:t>
+      </w:r>
+      <w:r>
+        <w:rPr>
+          <w:rFonts w:ascii="Calibri" w:hAnsi="Calibri"/>
+          <w:b w:val="0"/>
+          <w:i w:val="0"/>
+          <w:color w:val="14181D"/>
+          <w:sz w:val="19"/>
+        </w:rPr>
+        <w:t xml:space="preserve">. Latency and memory timed locally with no model calls; build time and token spend read from the logs of the runs that produced the locked results. Anything neither locally measurable nor recorded is marked </w:t>
+      </w:r>
+      <w:r>
+        <w:rPr>
+          <w:rFonts w:ascii="Calibri" w:hAnsi="Calibri"/>
+          <w:b/>
+          <w:i w:val="0"/>
+          <w:color w:val="14181D"/>
+          <w:sz w:val="19"/>
+        </w:rPr>
+        <w:t>not measured</w:t>
+      </w:r>
+      <w:r>
+        <w:rPr>
+          <w:rFonts w:ascii="Calibri" w:hAnsi="Calibri"/>
+          <w:b w:val="0"/>
+          <w:i w:val="0"/>
+          <w:color w:val="14181D"/>
+          <w:sz w:val="19"/>
+        </w:rPr>
+        <w:t xml:space="preserve"> rather than estimated.</w:t>
+      </w:r>
+    </w:p>
+    <w:p>
+      <w:pPr>
+        <w:jc w:val="both"/>
+      </w:pPr>
+      <w:r>
+        <w:rPr>
+          <w:rFonts w:ascii="Calibri" w:hAnsi="Calibri"/>
+          <w:b w:val="0"/>
+          <w:i w:val="0"/>
+          <w:color w:val="14181D"/>
+          <w:sz w:val="19"/>
+        </w:rPr>
+        <w:t>Machine: Windows, 6 physical / 12 logical cores, 15.7 GB RAM, Python 3.11, CPU only.</w:t>
+      </w:r>
+    </w:p>
+    <w:p>
+      <w:pPr>
+        <w:jc w:val="both"/>
+      </w:pPr>
+      <w:r>
+        <w:rPr>
+          <w:rFonts w:ascii="Calibri" w:hAnsi="Calibri"/>
+          <w:b w:val="0"/>
+          <w:i w:val="0"/>
+          <w:color w:val="14181D"/>
+          <w:sz w:val="19"/>
+        </w:rPr>
+        <w:t xml:space="preserve">Retrieval-only query latency over all 127 gold questions — embed, text search, caption / page-crop / image / graph expansion, cross-encoder rerank: </w:t>
+      </w:r>
+      <w:r>
+        <w:rPr>
+          <w:rFonts w:ascii="Calibri" w:hAnsi="Calibri"/>
+          <w:b/>
+          <w:i w:val="0"/>
+          <w:color w:val="14181D"/>
+          <w:sz w:val="19"/>
+        </w:rPr>
+        <w:t>p50 3.67 s, p95 13.44 s</w:t>
+      </w:r>
+      <w:r>
+        <w:rPr>
+          <w:rFonts w:ascii="Calibri" w:hAnsi="Calibri"/>
+          <w:b w:val="0"/>
+          <w:i w:val="0"/>
+          <w:color w:val="14181D"/>
+          <w:sz w:val="19"/>
+        </w:rPr>
+        <w:t xml:space="preserve">, p99 15.30 s, mean 4.79 s, range 0.76–15.89 s. Cold start (three transformer models, two FAISS indices, the graph) </w:t>
+      </w:r>
+      <w:r>
+        <w:rPr>
+          <w:rFonts w:ascii="Calibri" w:hAnsi="Calibri"/>
+          <w:b/>
+          <w:i w:val="0"/>
+          <w:color w:val="14181D"/>
+          <w:sz w:val="19"/>
+        </w:rPr>
+        <w:t>14.6 s</w:t>
+      </w:r>
+      <w:r>
+        <w:rPr>
+          <w:rFonts w:ascii="Calibri" w:hAnsi="Calibri"/>
+          <w:b w:val="0"/>
+          <w:i w:val="0"/>
+          <w:color w:val="14181D"/>
+          <w:sz w:val="19"/>
+        </w:rPr>
+        <w:t>, paid once per process. The spread is wide because the reranker's pool size depends on how many routes fired — a question triggering caption, page-crop and graph expansion pays to rerank all of it.</w:t>
+      </w:r>
+    </w:p>
+    <w:p>
+      <w:pPr>
+        <w:jc w:val="both"/>
+      </w:pPr>
+      <w:r>
+        <w:rPr>
+          <w:rFonts w:ascii="Calibri" w:hAnsi="Calibri"/>
+          <w:b w:val="0"/>
+          <w:i w:val="0"/>
+          <w:color w:val="14181D"/>
+          <w:sz w:val="19"/>
+        </w:rPr>
+        <w:t xml:space="preserve">Memory: 60 MB interpreter baseline → </w:t>
+      </w:r>
+      <w:r>
+        <w:rPr>
+          <w:rFonts w:ascii="Calibri" w:hAnsi="Calibri"/>
+          <w:b/>
+          <w:i w:val="0"/>
+          <w:color w:val="14181D"/>
+          <w:sz w:val="19"/>
+        </w:rPr>
+        <w:t>2,466 MB peak</w:t>
+      </w:r>
+      <w:r>
+        <w:rPr>
+          <w:rFonts w:ascii="Calibri" w:hAnsi="Calibri"/>
+          <w:b w:val="0"/>
+          <w:i w:val="0"/>
+          <w:color w:val="14181D"/>
+          <w:sz w:val="19"/>
+        </w:rPr>
+        <w:t xml:space="preserve"> with everything resident. The three models coexist on CPU; on the 4 GB GPU this project targets they would need sequencing.</w:t>
+      </w:r>
+    </w:p>
+    <w:p>
+      <w:pPr>
+        <w:jc w:val="both"/>
+      </w:pPr>
+      <w:r>
+        <w:rPr>
+          <w:rFonts w:ascii="Calibri" w:hAnsi="Calibri"/>
+          <w:b w:val="0"/>
+          <w:i w:val="0"/>
+          <w:color w:val="14181D"/>
+          <w:sz w:val="19"/>
+        </w:rPr>
+        <w:t xml:space="preserve">Corpus build: OCR ingest of 490 pages </w:t>
+      </w:r>
+      <w:r>
+        <w:rPr>
+          <w:rFonts w:ascii="Calibri" w:hAnsi="Calibri"/>
+          <w:b/>
+          <w:i w:val="0"/>
+          <w:color w:val="14181D"/>
+          <w:sz w:val="19"/>
+        </w:rPr>
+        <w:t>119.7 min</w:t>
+      </w:r>
+      <w:r>
+        <w:rPr>
+          <w:rFonts w:ascii="Calibri" w:hAnsi="Calibri"/>
+          <w:b w:val="0"/>
+          <w:i w:val="0"/>
+          <w:color w:val="14181D"/>
+          <w:sz w:val="19"/>
+        </w:rPr>
+        <w:t xml:space="preserve"> (14.7 s/page, 5,619 chunks; per-shard 1670/1424/1495/1359/1233 s). OCR dominates construction and is single-threaded CPU work — the stage that would gain most from parallelism or a GPU backend. KG extraction over 4,776 chunks: </w:t>
+      </w:r>
+      <w:r>
+        <w:rPr>
+          <w:rFonts w:ascii="Calibri" w:hAnsi="Calibri"/>
+          <w:b/>
+          <w:i w:val="0"/>
+          <w:color w:val="14181D"/>
+          <w:sz w:val="19"/>
+        </w:rPr>
+        <w:t>3,876,391 tokens, $0.6397</w:t>
+      </w:r>
+      <w:r>
+        <w:rPr>
+          <w:rFonts w:ascii="Calibri" w:hAnsi="Calibri"/>
+          <w:b w:val="0"/>
+          <w:i w:val="0"/>
+          <w:color w:val="14181D"/>
+          <w:sz w:val="19"/>
+        </w:rPr>
+        <w:t>.</w:t>
+      </w:r>
+    </w:p>
+    <w:p>
+      <w:pPr>
+        <w:jc w:val="both"/>
+      </w:pPr>
+      <w:r>
+        <w:rPr>
+          <w:rFonts w:ascii="Calibri" w:hAnsi="Calibri"/>
+          <w:b/>
+          <w:i w:val="0"/>
+          <w:color w:val="14181D"/>
+          <w:sz w:val="19"/>
+        </w:rPr>
+        <w:t>Not measured, and left that way:</w:t>
+      </w:r>
+      <w:r>
+        <w:rPr>
+          <w:rFonts w:ascii="Calibri" w:hAnsi="Calibri"/>
+          <w:b w:val="0"/>
+          <w:i w:val="0"/>
+          <w:color w:val="14181D"/>
+          <w:sz w:val="19"/>
+        </w:rPr>
+        <w:t xml:space="preserve"> end-to-end latency including the answer model (the harness recorded answers and scores per question but never wall-clock); BGE and BiomedCLIP index-build wall-clock (not recorded at the time); per-config API cost (no per-question token counts, and the ablation prints cost per invocation). The six-config total is known only to about $5, because the first invocation crashed on a rate limit before printing its cost line — roughly $0.83 per config, which is a division of a measured total rather than a measured quantity.</w:t>
       </w:r>
     </w:p>
     <w:sectPr>

</xml_diff>